<commit_message>
Update NOTE per Programmazione Avanzata ed elementi di ingegneria del software (5 cfu).docx
</commit_message>
<xml_diff>
--- a/Slides/NOTE per Programmazione Avanzata ed elementi di ingegneria del software (5 cfu).docx
+++ b/Slides/NOTE per Programmazione Avanzata ed elementi di ingegneria del software (5 cfu).docx
@@ -316,19 +316,6 @@
       </w:r>
     </w:p>
     <w:p/>
-    <w:p>
-      <w:r>
-        <w:t xml:space="preserve">NB: l’esame verrà svolto sulla piattaforma </w:t>
-      </w:r>
-      <w:hyperlink r:id="rId5">
-        <w:r>
-          <w:rPr>
-            <w:rStyle w:val="Collegamentoipertestuale"/>
-          </w:rPr>
-          <w:t>https://codeboard.io/</w:t>
-        </w:r>
-      </w:hyperlink>
-    </w:p>
     <w:p/>
     <w:p/>
     <w:p/>

</xml_diff>